<commit_message>
Update RSM cover letter: add editors, latest IONE title, regenerate docx and zip
Co-Authored-By: Tatsuki Onishi <bougtoir@gmail.com>
</commit_message>
<xml_diff>
--- a/results/manuscript/rsm_submission/cover_letter_rsm.docx
+++ b/results/manuscript/rsm_submission/cover_letter_rsm.docx
@@ -14,7 +14,7 @@
     </w:p>
     <w:p>
       <w:r>
-        <w:t>Professor [Editor-in-Chief name], Editor-in-Chief</w:t>
+        <w:t>Professors Dimitris Mavridis and Terri Pigott, Co-Editors-in-Chief</w:t>
       </w:r>
     </w:p>
     <w:p>
@@ -34,7 +34,7 @@
     </w:p>
     <w:p>
       <w:r>
-        <w:t>Dear Professor [Name],</w:t>
+        <w:t>Dear Professors Mavridis and Pigott,</w:t>
       </w:r>
     </w:p>
     <w:p>
@@ -45,7 +45,7 @@
         <w:rPr>
           <w:b/>
         </w:rPr>
-        <w:t>"A coherence diagnostic for hidden effect modification in individual participant data meta-analysis: a simulation study of stratification-based extraction"</w:t>
+        <w:t>"IONE: Incoherence-Oriented Neutralisation and Extraction for hidden effect modification in individual participant data meta-analysis: a simulation study of stratification-based extraction"</w:t>
       </w:r>
       <w:r>
         <w:t xml:space="preserve">, for consideration by </w:t>

</xml_diff>